<commit_message>
Sync BD docs 2026-07-08-v1 (202607200303) from my-cloud-project@88310eb
</commit_message>
<xml_diff>
--- a/rust-nail-ch1/锈钉_第一章_价码.docx
+++ b/rust-nail-ch1/锈钉_第一章_价码.docx
@@ -87,7 +87,16 @@
         <w:ind w:firstLine="420"/>
       </w:pPr>
       <w:r>
-        <w:t>锈钉把左手腕上的提取器扣好，指节上还留着洗不掉的琥珀色。酒保没问这一管是谁的，也没问编号。荒原规矩：交酵的人不记名，收酵的人不开口。</w:t>
+        <w:t>锈钉把左手腕上的提取器扣好，指节上还留着洗不掉的琥珀色。酒保没问这一管是谁的，也没问编号。荒原规矩：交酵的人不记名，收酵的人不开口——</w:t>
+      </w:r>
+      <w:r>
+        <w:rPr>
+          <w:b/>
+        </w:rPr>
+        <w:t>回收槽是黑市链的一环</w:t>
+      </w:r>
+      <w:r>
+        <w:t>，问多了反而麻烦。</w:t>
       </w:r>
     </w:p>
     <w:p>
@@ -105,7 +114,7 @@
         <w:ind w:firstLine="420"/>
       </w:pPr>
       <w:r>
-        <w:t>酒保推过一只锡杯。酒液浊，带着锈水底下那股发甜的腥。锈钉喝了一口，不尝味道，只确认喉咙里有东西下去。</w:t>
+        <w:t>酒保推过一只锡杯。酒液浊，带着锈水底下那股发甜的腥。锈钉喝了一口，不尝味道，只确认喉咙里有东西下去。杯里的酒和刚才交出去的那管酵，可能来自同一个酿民；也可能不是。黑市不保证溯源，只保证能喝。</w:t>
       </w:r>
     </w:p>
     <w:p>
@@ -114,7 +123,7 @@
         <w:ind w:firstLine="420"/>
       </w:pPr>
       <w:r>
-        <w:t>Saloon 里灯刚稳过来。尘暴傍晚刚走，全息悬赏条一格一格亮，像有人在水底眨眼。墙上电视没关，城带的琥珀交易所行情在静音里滚动——</w:t>
+        <w:t>Saloon 里灯刚稳过来。尘暴傍晚刚走，全息委托条一格一格亮，像有人在水底眨眼。墙上电视没关，城带的琥珀交易所行情在静音里滚动——</w:t>
       </w:r>
     </w:p>
     <w:p>
@@ -198,7 +207,7 @@
         <w:ind w:firstLine="420"/>
       </w:pPr>
       <w:r>
-        <w:t>过去十天，他脑子里只有三句话。接单。追。交。</w:t>
+        <w:t>过去十天，他脑子里只有三句话。接单。击晕。提取。</w:t>
       </w:r>
     </w:p>
     <w:p>
@@ -207,7 +216,7 @@
         <w:ind w:firstLine="420"/>
       </w:pPr>
       <w:r>
-        <w:t xml:space="preserve">布告栏上，未登记酿民，代号 </w:t>
+        <w:t xml:space="preserve">布告栏上，客户指定酿民，代号 </w:t>
       </w:r>
       <w:r>
         <w:rPr>
@@ -216,7 +225,7 @@
         <w:t>R-441</w:t>
       </w:r>
       <w:r>
-        <w:t>。赏金平常。交付时限四十八垦时。锈钉在公会副本上签了字，笔尖划过纸面，声音很轻，像砂粒擦过铁。</w:t>
+        <w:t>。酬金平常。交付时限四十八垦时。锈钉在公会委托副本上签了字，笔尖划过纸面，声音很轻，像砂粒擦过铁。</w:t>
       </w:r>
     </w:p>
     <w:p>
@@ -225,7 +234,7 @@
         <w:ind w:firstLine="420"/>
       </w:pPr>
       <w:r>
-        <w:t>他从来不看脸。脸会留在脑子里，碍事。编号不会。R-441 和 R-440 没有区别，和明天要接的 R-442 也不会有区别。</w:t>
+        <w:t>他从来不看脸。脸会留在脑子里，碍事。编号不会。R-441 和 R-440 没有区别，和明天要接的 R-442 也不会有区别。公会对外叫他猎人；他自己知道干的是什么——找到人，击晕，按客户要求从体内取出威士忌，再交给回收槽或中间人出手。</w:t>
       </w:r>
     </w:p>
     <w:p>
@@ -333,7 +342,7 @@
         <w:rPr>
           <w:b/>
         </w:rPr>
-        <w:t>酬金：标准酿民悬赏 ×5</w:t>
+        <w:t>酬金：标准提取委托 ×5</w:t>
       </w:r>
     </w:p>
     <w:p>
@@ -345,7 +354,7 @@
         <w:rPr>
           <w:b/>
         </w:rPr>
-        <w:t>备注：尽量活捉。委托人加密（窖行格式）</w:t>
+        <w:t>备注：尽量活捉（完整窖芯）。委托人加密（窖行格式）</w:t>
       </w:r>
     </w:p>
     <w:p>
@@ -393,7 +402,25 @@
         <w:ind w:firstLine="420"/>
       </w:pPr>
       <w:r>
-        <w:t>他不问「为什么活捉」。脚注有一行小字：*与城带登记酿民冲突，以城酿署登记为准。* 锈钉从来不读脚注。城带的事在电视里滚动，在别人的嘴里交换，在很远的地方发生——酿民排队采酿，换琥珀币，像人类上班。与他无关。他在城缘，在 Saloon，在回收槽和布告栏之间。</w:t>
+        <w:t>他不问「为什么活捉」。活捉意味着窖芯完整，黑市能再翻一倍价。脚注有一行小字：*与城带登记酿民冲突，以城酿署登记为准。* 锈钉从来不读脚注。城带的事在电视里滚动——酿民排队</w:t>
+      </w:r>
+      <w:r>
+        <w:rPr>
+          <w:b/>
+        </w:rPr>
+        <w:t>合法</w:t>
+      </w:r>
+      <w:r>
+        <w:t>采酿，换琥珀币，像人类上班。与他无关。他在城缘，在 Saloon，在回收槽和布告栏之间，干的是</w:t>
+      </w:r>
+      <w:r>
+        <w:rPr>
+          <w:b/>
+        </w:rPr>
+        <w:t>非法提取</w:t>
+      </w:r>
+      <w:r>
+        <w:t>。</w:t>
       </w:r>
     </w:p>
     <w:p>
@@ -504,7 +531,7 @@
         <w:ind w:firstLine="420"/>
       </w:pPr>
       <w:r>
-        <w:t>接单。追。交。</w:t>
+        <w:t>接单。击晕。提取。</w:t>
       </w:r>
     </w:p>
     <w:p>

</xml_diff>

<commit_message>
Sync BD docs 2026-07-08-v1 (202607200413) from my-cloud-project@9f560ad
</commit_message>
<xml_diff>
--- a/rust-nail-ch1/锈钉_第一章_价码.docx
+++ b/rust-nail-ch1/锈钉_第一章_价码.docx
@@ -20,7 +20,7 @@
           <w:color w:val="666666"/>
           <w:sz w:val="20"/>
         </w:rPr>
-        <w:t>**试写稿** · v13 开篇</w:t>
+        <w:t>**试写稿** · v18 开篇</w:t>
       </w:r>
     </w:p>
     <w:p>
@@ -216,7 +216,7 @@
         <w:ind w:firstLine="420"/>
       </w:pPr>
       <w:r>
-        <w:t xml:space="preserve">布告栏上，客户指定酿民，代号 </w:t>
+        <w:t xml:space="preserve">布告栏上，潜逃奴役酿民，园区编号 </w:t>
       </w:r>
       <w:r>
         <w:rPr>
@@ -225,7 +225,7 @@
         <w:t>R-441</w:t>
       </w:r>
       <w:r>
-        <w:t>。酬金平常。交付时限四十八垦时。锈钉在公会委托副本上签了字，笔尖划过纸面，声音很轻，像砂粒擦过铁。</w:t>
+        <w:t>。酬金平常。交付时限四十八垦时。锈钉在警署悬赏副本上签了字，笔尖划过纸面，声音很轻，像砂粒擦过铁。</w:t>
       </w:r>
     </w:p>
     <w:p>
@@ -234,7 +234,7 @@
         <w:ind w:firstLine="420"/>
       </w:pPr>
       <w:r>
-        <w:t>他从来不看脸。脸会留在脑子里，碍事。编号不会。R-441 和 R-440 没有区别，和明天要接的 R-442 也不会有区别。公会对外叫他猎人；他自己知道干的是什么——找到人，击晕，按客户要求从体内取出威士忌，再交给回收槽或中间人出手。</w:t>
+        <w:t>他从来不看脸。脸会留在脑子里，碍事。编号不会。R-441 和 R-440 没有区别，和明天要接的 R-442 也不会有区别。警署对外叫他缉拿手；他自己知道干的是什么——找到人，击晕，按布告要求从体内取出威士忌，再交给回收槽或中间人出手。</w:t>
       </w:r>
     </w:p>
     <w:p>
@@ -330,7 +330,7 @@
         <w:rPr>
           <w:b/>
         </w:rPr>
-        <w:t>类别：脱约 / 未登记（窖酿级）</w:t>
+        <w:t>类别：脱约 / 潜逃奴役酿民（窖酿级）</w:t>
       </w:r>
     </w:p>
     <w:p>
@@ -342,7 +342,7 @@
         <w:rPr>
           <w:b/>
         </w:rPr>
-        <w:t>酬金：标准提取委托 ×5</w:t>
+        <w:t>酬金：标准酿民悬赏 ×5</w:t>
       </w:r>
     </w:p>
     <w:p>
@@ -447,7 +447,7 @@
         <w:ind w:firstLine="420"/>
       </w:pPr>
       <w:r>
-        <w:t>酒保把红标单收进柜台下的铁夹，只说一句：「第三水窖 network 的入口图，公会刚更新。别走老岔道，上月死过两个抄近路的。」</w:t>
+        <w:t>酒保把红标单收进柜台下的铁夹，只说一句：「第三水窖 network 的入口图，警署刚更新。别走老岔道，上月死过两个抄近路的。」</w:t>
       </w:r>
     </w:p>
     <w:p>
@@ -495,7 +495,7 @@
         <w:ind w:firstLine="420"/>
       </w:pPr>
       <w:r>
-        <w:t>推门，风沙扑面。城缘的夜比城里冷，冷得干脆。远处天际，铁瓶车队的导航灯一闪，又隐进低尘里，像巨兽眨眼。锈钉把猎装领口拉高，走向公会租来的沙地摩托。</w:t>
+        <w:t>推门，风沙扑面。城缘的夜比城里冷，冷得干脆。远处天际，铁瓶车队的导航灯一闪，又隐进低尘里，像巨兽眨眼。锈钉把猎装领口拉高，走向警署驻点外编外配发的沙地摩托。</w:t>
       </w:r>
     </w:p>
     <w:p>

</xml_diff>